<commit_message>
Add comprehensive project documentation
Co-authored-by: Copilot <223556219+Copilot@users.noreply.github.com>
</commit_message>
<xml_diff>
--- a/GUIA-DE-ESTUDIO.docx
+++ b/GUIA-DE-ESTUDIO.docx
@@ -207,7 +207,7 @@
     <w:p/>
     <w:p>
       <w:r>
-        <w:t>El intento anterior de crear el servicio gratuito en Azure terminó con el sitio deshabilitado por QuotaExceeded; Azure devolvió “Site Disabled”. La web y la API no están publicadas de manera funcional y no se produjo un APK. La cuenta de prueba mencionada en el historial anterior reside en una base local, ignorada por Git, no en una base de datos pública. No presentar el sitio como desplegado ni distribuir una dirección como si estuviera activa.</w:t>
+        <w:t>Estado comprobado el 23 de octubre de 2026: existe el App Service efficient-parking-3126533e en Azure, pero el último despliegue terminó con HTTP 502 en Kudu y /health devolvió HTTP 503. La URL no debe presentarse como disponible hasta recuperar el servicio y repetir las pruebas. El plan actual se cambió a B1 y puede generar cargos. El APK existe como release, pero no se ha probado en un teléfono físico. El asistente IA requiere AI_API_KEY.</w:t>
       </w:r>
     </w:p>
     <w:p/>
@@ -423,11 +423,7 @@
               </w:rPr>
             </w:pPr>
             <w:r>
-              <w:rPr>
-                <w:rFonts w:ascii="Aptos" w:hAnsi="Aptos"/>
-                <w:sz w:val="17"/>
-              </w:rPr>
-              <w:t>Implementado para desarrollo local; Azure no está operativo</w:t>
+              <w:t>La arquitectura existe; el servicio de Azure no respondió en la última comprobación</w:t>
             </w:r>
           </w:p>
         </w:tc>
@@ -609,11 +605,7 @@
               </w:rPr>
             </w:pPr>
             <w:r>
-              <w:rPr>
-                <w:rFonts w:ascii="Aptos" w:hAnsi="Aptos"/>
-                <w:sz w:val="17"/>
-              </w:rPr>
-              <w:t>Pendiente: la instancia Azure quedó QuotaExceeded</w:t>
+              <w:t>Estado comprobado el 23 de octubre de 2026: existe el App Service efficient-parking-3126533e en Azure, pero el último despliegue terminó con HTTP 502 en Kudu y /health devolvió HTTP 503. La URL no debe presentarse como disponible hasta recuperar el servicio y repetir las pruebas. El plan actual se cambió a B1 y puede generar cargos. El APK existe como release, pero no se ha probado en un teléfono físico. El asistente IA requiere AI_API_KEY.</w:t>
             </w:r>
           </w:p>
         </w:tc>
@@ -671,11 +663,7 @@
               </w:rPr>
             </w:pPr>
             <w:r>
-              <w:rPr>
-                <w:rFonts w:ascii="Aptos" w:hAnsi="Aptos"/>
-                <w:sz w:val="17"/>
-              </w:rPr>
-              <w:t>Pendientes: no hay URL operativa ni APK generado en este estado</w:t>
+              <w:t>URL y APK publicados; la disponibilidad de Azure y la instalación en teléfono no están verificadas</w:t>
             </w:r>
           </w:p>
         </w:tc>
@@ -6285,7 +6273,7 @@
     <w:p/>
     <w:p>
       <w:r>
-        <w:t>La cuenta es Azure for Students y la región México Central se eligió dentro de las regiones permitidas. Azure permitió crear recursos, pero el sitio terminó deshabilitado como QuotaExceeded. Es un bloqueo del proveedor, no evidencia de que la API ya esté disponible. Volver a lanzar el script antes de que Azure libere cuota puede crear recursos parcialmente configurados o repetir el error.</w:t>
+        <w:t>Estado comprobado el 23 de octubre de 2026: existe el App Service efficient-parking-3126533e en Azure, pero el último despliegue terminó con HTTP 502 en Kudu y /health devolvió HTTP 503. La URL no debe presentarse como disponible hasta recuperar el servicio y repetir las pruebas. El plan actual se cambió a B1 y puede generar cargos. El APK existe como release, pero no se ha probado en un teléfono físico. El asistente IA requiere AI_API_KEY.</w:t>
       </w:r>
     </w:p>
     <w:p/>
@@ -6628,7 +6616,7 @@
     <w:p/>
     <w:p>
       <w:r>
-        <w:t>Azure muestra Site Disabled/QuotaExceeded. No insistir con despliegues idénticos ni escoger plan de pago. Confirmar cuota con Azure; el sitio no es un servicio público mientras siga deshabilitado.</w:t>
+        <w:t>Azure devolvió HTTP 502 en el último despliegue y HTTP 503 en /health. Revisar Kudu y costos antes de repetir; no declarar disponibilidad hasta que pasen las pruebas públicas.</w:t>
       </w:r>
     </w:p>
     <w:p/>
@@ -7697,7 +7685,7 @@
     <w:p/>
     <w:p>
       <w:r>
-        <w:t>¿El proyecto ya está en Azure? Se intentó publicar con App Service F1 en Mexico Central, pero Azure deshabilitó el sitio por cuota (QuotaExceeded). No existe una URL operativa confirmada ni APK generado en este estado.</w:t>
+        <w:t>Estado comprobado el 23 de octubre de 2026: existe el App Service efficient-parking-3126533e en Azure, pero el último despliegue terminó con HTTP 502 en Kudu y /health devolvió HTTP 503. La URL no debe presentarse como disponible hasta recuperar el servicio y repetir las pruebas. El plan actual se cambió a B1 y puede generar cargos. El APK existe como release, pero no se ha probado en un teléfono físico. El asistente IA requiere AI_API_KEY.</w:t>
       </w:r>
     </w:p>
     <w:p/>
@@ -9018,7 +9006,7 @@
         <w:pStyle w:val="ListParagraph"/>
       </w:pPr>
       <w:r>
-        <w:t>Azure debe permitir activar un plan gratuito: el sitio anterior quedó deshabilitado por `QuotaExceeded`.</w:t>
+        <w:t>Estado comprobado el 23 de octubre de 2026: existe el App Service efficient-parking-3126533e en Azure, pero el último despliegue terminó con HTTP 502 en Kudu y /health devolvió HTTP 503. La URL no debe presentarse como disponible hasta recuperar el servicio y repetir las pruebas. El plan actual se cambió a B1 y puede generar cargos. El APK existe como release, pero no se ha probado en un teléfono físico. El asistente IA requiere AI_API_KEY.</w:t>
       </w:r>
     </w:p>
     <w:p>

</xml_diff>